<commit_message>
chore(2209a): başvuru paketi çalışma durumu + üretim betikleri
TÜBİTAK 2209-A paketinin önceki oturumda kalan çalışma durumu. Kod değil, belge
üretim hattı — backend/frontend'e dokunmaz.

İÇERİK
- 2209A_BASVURU_TESLIM.docx + REHBERLI_SABLON + KONTROL_LISTESI (güncel hâl)
- uretim/ — güç simülasyonu (Monte Carlo, seed 20260808), h2 senaryoları,
  dış geri bildirim doğrulaması, taze ölçüm işleme, biçim/akış/tasarım betikleri
- BULGULAR.md — altı hakemli inceleme turunun bulgu defteri
- docs/benchmark/ablation.md — 8 Ağu ablasyon koşumunun çıktısı

AÇIK İŞ (bilerek kapatılmadı)
Belge şu an 21 SAYFA; kullanıcının koyduğu "ekler dâhil en fazla 20" sınırını
aşıyor. Son taze ölçüm eklemesi (+813 karakter) taşırdı. ~800 karakter kısaltılıp
yeniden ölçülmesi gerekiyor (sayfa sayımı Word COM ile, uretim/sayfa_govde.ps1).
Bu durum OKUBENI.md'de de yazılı.

Co-Authored-By: Claude Opus 5 <noreply@anthropic.com>
</commit_message>
<xml_diff>
--- a/tubitak-2209a/2209A_REHBERLI_SABLON.docx
+++ b/tubitak-2209a/2209A_REHBERLI_SABLON.docx
@@ -646,7 +646,7 @@
                 <w:color w:val="111111"/>
                 <w:sz w:val="18"/>
               </w:rPr>
-              <w:t>Kamu kurumlarına ulaşan yazılı evrakın türünün belirlenmesi, zorunlu bilgi unsurlarının çıkarılması, eksik bilgi denetimi, ilgili mevzuatın bulunması, doğru birime yönlendirilmesi ve resmî yazışma kurallarına uygun cevap taslağının hazırlanması bugün ağırlıklı olarak el emeğiyle yürütülmektedir. Üretici dil modelleri bu süreci hızlandırabilir; ancak hukuki sonuç doğuran bir alanda asıl sorun hızın değil, üretilen metnin kaynağa dayanaklılığının ölçülebilir biçimde güvence altına alınmasıdır. Alanyazında Türkçe idari yazışma için kamuya açık ve tekrar üretilebilir bir değerlendirme kümesi bulunmamakta, dayanaklılık üretim sonrasında etiketlenen bir ölçüt olarak ele alınmakta, insan gözetimi ise ampirik olarak sınanmayan normatif bir ilke düzeyinde kalmaktadır.</w:t>
+              <w:t>Kamu kurumlarına gelen evrakın türünü belirlemek, zorunlu bilgi unsurlarını çıkarmak, eksiğini görmek, dayanağını bulmak, doğru birime yöneltmek ve cevap taslağını yazmak bugün ağırlıklı olarak el emeğiyle yürütülür. Bu araştırma, dil modellerinin bu işi devralabilmesinin asıl koşulunu sınar: üretilen metnin kaynağa dayanaklılığının ölçülebilir biçimde güvence altına alınması. Hukuki sonuç doğuran bir alanda sorun hız değildir. Bir cümlenin hangi belgeye dayandığı gösterilemiyorsa hızlı üretim riski büyütür.</w:t>
             </w:r>
           </w:p>
           <w:p>
@@ -662,12 +662,13 @@
                 <w:color w:val="111111"/>
                 <w:sz w:val="18"/>
               </w:rPr>
-              <w:t>Bu araştırma, artefakta bağlı olmayan tek bir önermeyi sınar: olasılıksal bir üretecin çıktısı üzerindeki kısıt, üretim sonrasında bir süzgeç olarak değil üretim anında seçim uzayının daraltılması olarak uygulandığında, kısıtın sağladığı kazanç girdinin belirsizliği arttıkça büyür; ancak doğru cevap kısıtlanan kümenin dışındaysa aynı mekanizma sistematik bir hata kaynağına döner. Önerme yanlışlanabilirdir ve idari yazışma, cevap uzayının kapalı tanımlanabildiği ve hatanın hukuki bedelinin ölçülebildiği bir alan olduğu için sınama alanı seçilmiştir.</w:t>
+              <w:t>Alanyazında üç eksik birlikte durmaktadır. Türkçe idari yazışma için kamuya açık ve yeniden üretilebilir bir değerlendirme kümesi yoktur. Dayanaklılık, üretim sonrasında etiketlenen bir ölçüt olarak ele alınmaktadır. Bu ölçütün kendi geçerliliği ise bağımsız bir dış yargıya karşı sınanmamıştır.</w:t>
             </w:r>
           </w:p>
           <w:p>
             <w:pPr>
               <w:spacing w:after="40"/>
+              <w:jc w:val="both"/>
             </w:pPr>
             <w:r>
               <w:rPr>
@@ -677,7 +678,23 @@
                 <w:color w:val="111111"/>
                 <w:sz w:val="18"/>
               </w:rPr>
-              <w:t>Program ön-kayıtlı dört deneyden oluşur.</w:t>
+              <w:t>Öneri, tek bir artefakta bağlı olmayan bir önermeyi sınar. Kısıt, üretim sonrasında süzgeç olarak değil üretim anında seçim uzayının daraltılması olarak uygulandığında, kazancı girdinin belirsizliği arttıkça büyür. Önerme yanlışlanabilirdir. Doğru cevap kısıtlanan kümenin dışındaysa aynı mekanizma sistematik bir hata kaynağına döner. Sınama alanı olarak idari yazışma seçilmiştir; çünkü cevap uzayı kapalı tanımlanabilir ve hatanın hukuki bedeli ölçülebilir.</w:t>
+            </w:r>
+          </w:p>
+          <w:p>
+            <w:pPr>
+              <w:spacing w:after="40"/>
+              <w:jc w:val="both"/>
+            </w:pPr>
+            <w:r>
+              <w:rPr>
+                <w:rFonts w:ascii="Arial" w:hAnsi="Arial" w:cs="Arial" w:eastAsia="Arial"/>
+                <w:b w:val="0"/>
+                <w:i w:val="0"/>
+                <w:color w:val="111111"/>
+                <w:sz w:val="18"/>
+              </w:rPr>
+              <w:t>Program ön-kayıtlı üç deneyden oluşur. Birinci deneyde karar kaynağının mimarisi dört seviyede, girdi bozulmasının üç seviyesiyle çaprazlanır; aynı 240 belge on iki koşulda işlenir. Dört seviye kural katmanı, kısıtsız tek geçişli üretim, geri getirmeyle güçlendirilmiş literatür tabanı ve kanıt-alıntı kısıtlı hibrittir.</w:t>
             </w:r>
           </w:p>
           <w:p>
@@ -708,7 +725,7 @@
                 <w:color w:val="111111"/>
                 <w:sz w:val="18"/>
               </w:rPr>
-              <w:t>Anahtar Kelimeler: Türkçe doğal dil işleme, resmî yazışma belge anlama, kaynak dayanaklılığı doğrulama, kontrollü ablasyon deneyi, insan gözetimli karar destek</w:t>
+              <w:t>Anahtar Kelimeler: Türkçe doğal dil işleme, resmî yazışma belge anlama, kaynak dayanaklılığı doğrulama, kontrollü ablasyon deneyi, denetlenebilir karar destek</w:t>
             </w:r>
           </w:p>
         </w:tc>
@@ -1232,7 +1249,7 @@
                 <w:color w:val="111111"/>
                 <w:sz w:val="18"/>
               </w:rPr>
-              <w:t>Kamu evrakında tür belirleme, bilgi unsuru çıkarma, eksik denetimi, dayanak mevzuatı bulma, doğru birime havale ve resmî cevap taslağı bugün el emeğiyle üretilir; yanlış havale evrakı geciktirir, kesin cevap süreleri (dilekçede otuz gün, bilgi edinmede on beş iş günü) kaçırıldığında hukuki sorumluluk doğar. Ön çalışmada derlenen envanter 4.066 kurum içerir; iç birim yapısı ancak dörtte birlik kesimde makine-okunurdur.</w:t>
+              <w:t>Kamu evrakında tür belirleme, bilgi unsuru çıkarma, eksik denetimi, dayanak bulma, havale ve cevap taslağı el emeğiyle üretilir; yanlış havale evrakı geciktirir, kesin cevap süreleri (dilekçede otuz gün, bilgi edinmede on beş iş günü) kaçırıldığında hukuki sorumluluk doğar. Ön çalışmada derlenen envanter 4.066 kurum içerir; iç birim yapısı ancak dörtte birlik kesimde makine-okunurdur.</w:t>
             </w:r>
           </w:p>
           <w:p>
@@ -1248,7 +1265,7 @@
                 <w:color w:val="111111"/>
                 <w:sz w:val="18"/>
               </w:rPr>
-              <w:t>Bilimsel problem şudur: hukuki sonuç doğuran bir alanda model çıktısının kaynağa dayanaklılığı hangi mimari kısıtlarla, hangi ölçüm geçerliliğiyle ve hangi insan gözetimi tasarımıyla güvence altına alınır? Evrak tamamen sentetiktir; amaç ürün değil, mimari kısıtın etkisini kontrollü deneyle ölçmektir.</w:t>
+              <w:t>Bilimsel problem şudur: hukuki sonuç doğuran bir alanda model çıktısının kaynağa dayanaklılığı hangi mimari kısıtlarla güvence altına alınır ve bu dayanaklılığın ölçüsü hangi geçerlilikle doğrulanır? Evrak tamamen sentetiktir, ölçüm birimi metindir; amaç kısıtın etkisini kontrollü deneyle ölçmektir.</w:t>
             </w:r>
           </w:p>
           <w:p>
@@ -1279,7 +1296,7 @@
                 <w:color w:val="111111"/>
                 <w:sz w:val="18"/>
               </w:rPr>
-              <w:t>Belge anlamada standart kıyas kümeleri vardır - bilgi çıkarımı [1] ve uçtan uca belge anlama [2] - ancak İngilizce ve görsel-form odaklıdır; idari yazışmaya özgü unsurları (ilgi zinciri, saklama planı kodu, imza-yetki bağı) modellemez. Türkçede sondan eklemeli yapının etkisi ölçülmüş [3], yapısal zorluklar derlenmiş [4], alan uyarlaması hukuk metinlerinde kalmıştır [5]. En yakın Türkçe çalışma dosya planı numarasını 169 belge ve tek kurumla incelemiş [6]; tür, bilgi çıkarımı ve taslak kalitesi ölçülmemiştir.</w:t>
+              <w:t>Belge anlamada standart kıyas kümeleri - bilgi çıkarımı [1] ve uçtan uca belge anlama [2] - İngilizce ve görsel-form odaklıdır; idari yazışmaya özgü unsurları (ilgi zinciri, saklama planı kodu, imza-yetki bağı) modellemez. Türkçede sondan eklemeli yapının etkisi ölçülmüş [3], zorluklar derlenmiş [4], alan uyarlaması hukukta kalmıştır [5]. En yakın Türkçe çalışma dosya planı numarasını 169 belge ve tek kurumla incelemiş [6]; tür, bilgi çıkarımı ve taslak kalitesi ölçülmemiştir.</w:t>
             </w:r>
           </w:p>
           <w:p>
@@ -1735,22 +1752,7 @@
                 <w:color w:val="111111"/>
                 <w:sz w:val="18"/>
               </w:rPr>
-              <w:t>Bu araştırmanın genel amacı, Türkçe idari yazışma belgelerinin makine ile işlenmesinde karar kaynağının mimari biçiminin - kural katmanı, kısıtsız tek geçişli üretim, şemaya bağlı ve geri getirmeyle güçlendirilmiş literatür tabanı ve kapalı-küme seçim ile kanıt-alıntı kısıtlarıyla donatılmış hibrit katman - belge anlama başarımı, üretilen resmî metnin kaynağa dayanaklılığı ve insan gözetiminin etkinliği üzerindeki etkisini ön-kayıtlı ve kontrollü bir faktöriyel deney düzeneğinde nedensel olarak kestirmek ve elde edilen ölçüm çerçevesini yeniden üretilebilir biçimde belgelemektir.</w:t>
-            </w:r>
-          </w:p>
-          <w:p>
-            <w:pPr>
-              <w:spacing w:after="40"/>
-            </w:pPr>
-            <w:r>
-              <w:rPr>
-                <w:rFonts w:ascii="Arial" w:hAnsi="Arial" w:cs="Arial" w:eastAsia="Arial"/>
-                <w:b w:val="0"/>
-                <w:i w:val="0"/>
-                <w:color w:val="111111"/>
-                <w:sz w:val="18"/>
-              </w:rPr>
-              <w:t>Amacın gerekçesi üç tespite dayanır:</w:t>
+              <w:t>Bu araştırmanın genel amacı, Türkçe idari yazışma belgelerinin makine ile işlenmesinde karar kaynağının mimari biçiminin (2.1'deki dört kol) belge anlama başarımı, resmî metnin kaynağa dayanaklılığı ve bu dayanaklılığı yargılayan ölçütün geçerliliği üzerindeki etkisini ön-kayıtlı ve kontrollü faktöriyel deneyde nedensel olarak kestirmek ve ölçüm çerçevesini yeniden üretilebilir biçimde belgelemektir. Gözlem birimi belgedir.</w:t>
             </w:r>
           </w:p>
           <w:p>
@@ -1766,7 +1768,22 @@
                 <w:color w:val="111111"/>
                 <w:sz w:val="18"/>
               </w:rPr>
-              <w:t>- Ölçüm gelenekleri İngilizce ve görsel form odaklıdır [1][2]; Türkçe idari yazışma için kamuya açık, etiketli bir değerlendirme kümesi yoktur, en yakın çalışma tek kurumda ve dar kapsamdadır [6]. Türkçenin sondan eklemeli yapısının başarımı etkilediği ölçülmüştür [3].</w:t>
+              <w:t>Amacın gerekçesi üç tespittir: ölçüm gelenekleri İngilizce ve görsel form odaklıdır, Türkçe idari yazışma için etiketli küme yoktur, en yakın çalışma tek kurumdadır [1][2][6]; geri getirmeli üretim hukukta dayanaksız iddiayı kaldırmaz, atfedilebilirlik üretim anında kısıt olarak değil sonrasında etiketlenen ölçü olarak ele alınır [7][9][10]; insan gözetimi normatif savunulur ama ön koşulu denetlenebilir çıktı kör uzman ölçütüne karşı sınanmamıştır [16][17]. Proje bu nedenle geliştirme işi değil, hipoteze bağlı bir sınama programıdır.</w:t>
+            </w:r>
+          </w:p>
+          <w:p>
+            <w:pPr>
+              <w:spacing w:after="40"/>
+            </w:pPr>
+            <w:r>
+              <w:rPr>
+                <w:rFonts w:ascii="Arial" w:hAnsi="Arial" w:cs="Arial" w:eastAsia="Arial"/>
+                <w:b w:val="0"/>
+                <w:i w:val="0"/>
+                <w:color w:val="111111"/>
+                <w:sz w:val="18"/>
+              </w:rPr>
+              <w:t>ÖZGÜL HEDEFLER (iş paketi eşlemesiyle)</w:t>
             </w:r>
           </w:p>
           <w:p>
@@ -1782,53 +1799,7 @@
                 <w:color w:val="111111"/>
                 <w:sz w:val="18"/>
               </w:rPr>
-              <w:t>- Geri getirmeyle güçlendirilmiş üretim, hukuki metinlerde dayanaksız iddiayı ortadan kaldırmaz [9][10]; atfedilebilirlik ise üretim sonrası etiketlenen bir ölçü olarak ele alınmakta [7], üretim anında dayatılan mimari kısıt olarak ölçülmemektedir.</w:t>
-            </w:r>
-          </w:p>
-          <w:p>
-            <w:pPr>
-              <w:spacing w:after="40"/>
-              <w:jc w:val="both"/>
-            </w:pPr>
-            <w:r>
-              <w:rPr>
-                <w:rFonts w:ascii="Arial" w:hAnsi="Arial" w:cs="Arial" w:eastAsia="Arial"/>
-                <w:b w:val="0"/>
-                <w:i w:val="0"/>
-                <w:color w:val="111111"/>
-                <w:sz w:val="18"/>
-              </w:rPr>
-              <w:t>- Alanyazın insan gözetimini normatif olarak savunmakta [16][17], etkinliğini bağımsız değişken olarak sınayan kontrollü deney sunmamaktadır.</w:t>
-            </w:r>
-          </w:p>
-          <w:p>
-            <w:pPr>
-              <w:spacing w:after="40"/>
-            </w:pPr>
-            <w:r>
-              <w:rPr>
-                <w:rFonts w:ascii="Arial" w:hAnsi="Arial" w:cs="Arial" w:eastAsia="Arial"/>
-                <w:b w:val="0"/>
-                <w:i w:val="0"/>
-                <w:color w:val="111111"/>
-                <w:sz w:val="18"/>
-              </w:rPr>
-              <w:t>Proje bu nedenle bir geliştirme işi değil, ölçülebilir hipotezlere bağlı bir sınama programıdır.</w:t>
-            </w:r>
-          </w:p>
-          <w:p>
-            <w:pPr>
-              <w:spacing w:after="40"/>
-            </w:pPr>
-            <w:r>
-              <w:rPr>
-                <w:rFonts w:ascii="Arial" w:hAnsi="Arial" w:cs="Arial" w:eastAsia="Arial"/>
-                <w:b w:val="0"/>
-                <w:i w:val="0"/>
-                <w:color w:val="111111"/>
-                <w:sz w:val="18"/>
-              </w:rPr>
-              <w:t>ÖZGÜL HEDEFLER (iş paketi eşlemesiyle)</w:t>
+              <w:t>Hedef 1 (İP1) - Deneysel çerçeve ve dairesellik denetimi: hipotezler, test ailesi, dışlama ölçütleri ve analiz planı veri toplanmadan önce ön-kayıtla kilitlenir; 19 elemanlı kapalı tür kümesi x üç zorluk çaprazında 240 ana + 120 replikasyon belgelik sentetik küme katmanlı örneklemeyle hazırlanır; bozma işleci gerçek taranmış belgelerde ölçülen hata oranına çapalanır. (Başarı ölçütü üç ara kilometre taşıyla verilir: 1.</w:t>
             </w:r>
           </w:p>
           <w:p>
@@ -2293,7 +2264,6 @@
           <w:p>
             <w:pPr>
               <w:spacing w:after="40"/>
-              <w:jc w:val="both"/>
             </w:pPr>
             <w:r>
               <w:rPr>
@@ -2303,13 +2273,12 @@
                 <w:color w:val="111111"/>
                 <w:sz w:val="18"/>
               </w:rPr>
-              <w:t>Bu öneri bir yazılım geliştirme işi değil, ön-kayıtlı hipotezleri kontrollü koşullarda sınayan ampirik bir deney programıdır. Omurga: literatür boşluğu -&gt; araştırma sorusu -&gt; yönü ilan edilmiş hipotez -&gt; bağımsız değişken -&gt; önceden tanımlı bağımlı değişken -&gt; karar kuralı. Dört bağlantılı deney kurulur.</w:t>
+              <w:t>Öneri, ön-kayıtlı hipotezleri kontrollü koşullarda sınayan üç bağlantılı deneyden oluşur.</w:t>
             </w:r>
           </w:p>
           <w:p>
             <w:pPr>
               <w:spacing w:after="40"/>
-              <w:jc w:val="both"/>
             </w:pPr>
             <w:r>
               <w:rPr>
@@ -2319,7 +2288,7 @@
                 <w:color w:val="111111"/>
                 <w:sz w:val="18"/>
               </w:rPr>
-              <w:t>D1 - Karar mimarisi x girdi bozulması (4 x 3, belge-içi tekrarlı ölçüm). Bağımsız değişken 1, karar kaynağıdır:</w:t>
+              <w:t>D1 - Karar mimarisi x girdi bozulması (4 x 3, belge-içi tekrarlı ölçüm). Bağımsız değişken 1, karar kaynağı:</w:t>
             </w:r>
           </w:p>
           <w:p>
@@ -2355,7 +2324,6 @@
           <w:p>
             <w:pPr>
               <w:spacing w:after="40"/>
-              <w:jc w:val="both"/>
             </w:pPr>
             <w:r>
               <w:rPr>
@@ -2365,7 +2333,7 @@
                 <w:color w:val="111111"/>
                 <w:sz w:val="18"/>
               </w:rPr>
-              <w:t>- (b2) LİTERATÜR TABANI - şemaya bağlanmış, geri getirmeyle güçlendirilmiş, öz-eleştirili tek geçişli üretim [11][12][13];</w:t>
+              <w:t>- (b2) literatür tabanı - şemaya bağlı, geri getirmeli, öz-eleştirili tek geçişli üretim [11][12][13];</w:t>
             </w:r>
           </w:p>
           <w:p>
@@ -2380,7 +2348,7 @@
                 <w:color w:val="111111"/>
                 <w:sz w:val="18"/>
               </w:rPr>
-              <w:t>- (c) kapalı-küme seçici ve kanıt-alıntı kısıtlarıyla donatılmış hibrit.</w:t>
+              <w:t>- (c) kapalı-küme seçici ve kanıt-alıntı kısıtlı hibrit.</w:t>
             </w:r>
           </w:p>
           <w:p>
@@ -2396,7 +2364,7 @@
                 <w:color w:val="111111"/>
                 <w:sz w:val="18"/>
               </w:rPr>
-              <w:t>H1'in BİRİNCİL kontrastı (c)-(b2)'dir; (b) kolu kısıtın toplam etkisini görünür kılan alt sınır referansıdır. Bağımsız değişken 2, karakter düzeyi girdi bozulmasıdır (temiz / orta / yüksek). Aynı 240 belge on iki koşulda işlenir: 240 x 4 x 3 = 2.880 gözlem.</w:t>
+              <w:t>(b2)'nin aslına uygunluğu bağımsız kabul testine bağlıdır: istem şablonları [12] ve [13]'ün kamuya açık referans uygulamalarına çapalanır, farkları ön-kayıt ekindedir; geri getirme ve öz-eleştiri tetiklenme oranı ilan edilen alt sınırın altında kalan koşum b2 sayılmaz.</w:t>
             </w:r>
           </w:p>
           <w:p>
@@ -2412,12 +2380,13 @@
                 <w:color w:val="111111"/>
                 <w:sz w:val="18"/>
               </w:rPr>
-              <w:t>SAĞLAYICI BLOĞU: Sağlayıcı yalnız model içeren kollara uygulanabildiğinden desen KISMEN ÇAPRAZLANMIŞtır. Blok, 80 belgelik alt kümede iki ek sağlayıcıda tekrarlanır (80 x 3 x 3 x 2 = 1.440 ek gözlem); toplam 4.320 gözlemin 720'si deterministik, 3.600'ü model çağrılıdır ve sağlayıcı x mimari etkileşimi olabilirlik-oranı testiyle sınanır.</w:t>
+              <w:t>H1'in birincil kontrastı (c)-(b2)'dir; (b) kısıtın toplam etkisini gösterir. Bağımsız değişken 2 karakter düzeyi bozulmadır (temiz / orta / yüksek): aynı 240 belge on iki koşulda işlenir, 240 x 4 x 3 = 2.880 gözlem. Sağlayıcı yalnız model içeren kollara uygulandığından desen kısmen çaprazlanmıştır; blok 80 belgede iki ek sağlayıcıda tekrarlanır (80 x 3 x 3 x 2 = 1.440 ek gözlem). Gözlemlerin 720'si deterministik, 3.600'ü model çağrılıdır.</w:t>
             </w:r>
           </w:p>
           <w:p>
             <w:pPr>
               <w:spacing w:after="40"/>
+              <w:jc w:val="both"/>
             </w:pPr>
             <w:r>
               <w:rPr>
@@ -2427,7 +2396,7 @@
                 <w:color w:val="111111"/>
                 <w:sz w:val="18"/>
               </w:rPr>
-              <w:t>D2 - Ölçüm geçerliliği çalışması.</w:t>
+              <w:t>D2 - Ölçüm geçerliliği: doğrulayıcı, sistemin kararını görmeyen üç bağımsız değerlendiricinin uzman yargısıyla (altın ölçüt [7]) karşılaştırılır. Değerlendirilen birim kişi değil metindeki iddiadır; ölçüt sistemin beyanı olmadığından dairesellik kırılır.</w:t>
             </w:r>
           </w:p>
           <w:p>
@@ -2871,7 +2840,7 @@
                 <w:color w:val="111111"/>
                 <w:sz w:val="18"/>
               </w:rPr>
-              <w:t>•  1-3. ay · İP1 — Deneysel çerçevenin kurulması, ön-kaydın kilitlenmesi ve katmanlı ölçüm kümesinin hazırlanması — Başarı ölçütü: Ön-kayıt 2. ay sonunda değiştirilemez kayıtla kilitli; gücü 0,80 altına düşen hücreler ilan edilmiş. 360 belgede altın etiket iki bağımsız kaynakta en az 0,90 uyumlu. Üç bozulma seviyesinde karakter hata oranı sapması 0,01'i geçmiyor. 13 bağımlı değişken için sürüm damgalı taban artefaktı mevcut. (katkı %15)</w:t>
+              <w:t>•  1-3. ay · İP1 — Deneysel çerçeve, ön-kayıt kilidi ve katmanlı ölçüm kümesinin hazırlanması — Başarı ölçütü: 1. ay sonu: üreteç ve etiket uzayı kilitli, 120 belge üretilmiş ve birinci kaynakta etiketlenmiş; etik kurula resmî görüş başvurusu yapılmış ve kayıt numarası alınmış. 2. ay sonu: ön-kayıt değiştirilemez zaman damgasıyla kilitli, gücü 0,80'in altında kalan hücreler ve H2 için saptanabilir en küçük etkileşim ilan edilmiş; 240 belgelik ana küme iki bağımsız kaynakta en az 0,90 uyumla etiketlenmiş ve sızıntı denetiminden geçmiş. 3. ay sonu: replikasyon kümesi mühürlenip ayrılmış; karakter hata oranı sapması üç seviyede 0,01'i geçmiyor; sözlük örtüşme oranı raporlanmış; on bağımlı değişkenin tamamı için sürüm damgalı taban artefaktı mevcut. Kısıtsız kolun yerel seviyedeki geçersiz çıktı oranı %20'yi aşarsa seviye tasarımdan çıkarılır. (katkı %17)</w:t>
             </w:r>
           </w:p>
           <w:p>
@@ -2888,7 +2857,7 @@
                 <w:color w:val="111111"/>
                 <w:sz w:val="18"/>
               </w:rPr>
-              <w:t>•  3-5. ay · İP2 — Karar kaynağı mimarisi ile girdi bozulma düzeyinin faktöriyel deneyi ve hata yayılımı analizi — Başarı ölçütü: 4.320 koşum artefaktının en az %98'i eksiksiz, sürüm damgalı ve yeniden üretilebilir. H1, H2, H3, H9 için etki büyüklüğü ve %95 güven aralığı; H1'in üç bağımlı değişkeninde aralık genişliği 0,15'ten dar, en az ikisinde güç 0,80 üzeri. Ön-kayıt planına uyum %100. Kırılma eşiği profil-olabilirlik %95 aralığıyla. (katkı %18)</w:t>
+              <w:t>•  3-5. ay · İP2 — Mimari x girdi bozulması faktöriyel deneyi ve hata yayılımı analizi — Başarı ölçütü: Koşum artefaktlarının en az %98'i eksiksiz, sürüm damgalı ve yeniden üretilebilir. H1, H2, H3 ve H7 için etki büyüklüğü ve %95 aralık raporlanmış; H1'in üç bağımlı değişkeninde aralık genişliği 0,15'ten dar, en az ikisinde güç 0,80 üzeri. Ön-kayıt planına uyum %100. Maliyet tavanı pilotla ölçülmüş. (katkı %25)</w:t>
             </w:r>
           </w:p>
           <w:p>
@@ -2905,7 +2874,7 @@
                 <w:color w:val="111111"/>
                 <w:sz w:val="18"/>
               </w:rPr>
-              <w:t>•  4-7. ay · İP3 — Otomatik dayanak doğrulayıcısının ölçüm geçerliliği ve değerlendiriciler arası uyumun belirlenmesi — Başarı ölçütü: 300 iddianın tamamı üç etiketleyici tarafından etiketlenmiş (tam çapraz). Krippendorff alfa kümelenmiş önyükleme %95 alt sınırı en az 0,67, nokta tahmini en az 0,80. Otomatik-insan / insan-insan uyum oranının %95 alt sınırının 0,75'i aşıp aşmadığı ilan edilmiş. Beş iddia sınıfı için ayrı duyarlılık-özgüllük tablosu. (katkı %18)</w:t>
+              <w:t>•  4-7. ay · İP3 — Dayanak doğrulayıcısının ölçüm geçerliliği ve kör uzman uyumu — Başarı ölçütü: 300 iddianın tamamı üç değerlendiricice tam çapraz desende yargılanmış. Krippendorff alfanın kümelenmiş önyükleme %95 alt sınırı en az 0,67, nokta tahmini en az 0,80. Normalize uyum oranının %95 alt sınırının 0,75'i aşıp aşmadığı ilan edilmiş; altında kalınırsa geçerlilik sınırı bulgu olarak yayımlanmış. Dış geçerlilik kümesi derlenmiş, iki kaynakta etiketlenmiş, uyum katsayısı ayrıca raporlanmış. (katkı %23)</w:t>
             </w:r>
           </w:p>
           <w:p>
@@ -2922,7 +2891,7 @@
                 <w:color w:val="111111"/>
                 <w:sz w:val="18"/>
               </w:rPr>
-              <w:t>•  6-8. ay · İP4 — Doğrulama kapısı sıkılığının ödünleşim eğrisi, müzakerenin yakınsaması ve mimarinin bedeli — Başarı ölçütü: Dokuz eşik noktası için ödünleşim eğrisi ve ROC alanı %95 güven aralığıyla üretilmiş. Seçilen çalışma noktasında yanlış-veto oranının %95 üst sınırı 0,05 veya altında; eşdeğerlik kararı açık. Doygunluk turu kestirilmiş; üç rol-çıkarma koşulunun her biri için kapanma oranı ayrı. Belge başına ek gecikme (saniye) ve ek maliyet (TL) sayısal; H10 kararı yazılmış. (katkı %15)</w:t>
+              <w:t>•  6-9. ay · İP4 — Kapı ödünleşim eğrisi, müzakerenin yakınsaması ve mimarinin bedeli — Başarı ölçütü: Dokuz eşik noktası için ödünleşim eğrisi ve ROC alanı %95 aralıkla üretilmiş. Seçilen çalışma noktasında yanlış-veto %95 üst sınırı 0,05 veya altında; eşdeğerlik kararı açık yazılmış. Doygunluk turu kestirilmiş; dört tur ve üç rol-çıkarma koşulu için kapanan, direnen ve yeni doğan bulgu sayıları ayrı verilmiş. Belge başına ek gecikme (saniye) ve ek maliyet (TL) sayısal; H8 kararı eşdeğerlik sınırıyla yazılmış. (katkı %21)</w:t>
             </w:r>
           </w:p>
           <w:p>
@@ -2939,24 +2908,7 @@
                 <w:color w:val="111111"/>
                 <w:sz w:val="18"/>
               </w:rPr>
-              <w:t>•  7-10. ay · İP5 — İnsan gözetiminin etkinliği: gerekçe düzeyinin kontrollü katılımcı deneyiyle sınanması — Başarı ölçütü: En az 28 katılımcı (hedef 32; bırakma %15 veya altı) ve en az 600 analiz edilebilir deneme kaydı tam. H7 birincil kontrastı taban koşula karşı, odds oranı ve %95 güven aralığıyla. H8 eşdeğerlik sınaması 0,05 sınırında sonuçlandırılmış. H11 tek yönlü sınanmış, sonucu aleyhte çıksa dahi raporlanmış. Her koşulda en az dört tohumlanmış hata sınıfı. (katkı %22)</w:t>
-            </w:r>
-          </w:p>
-          <w:p>
-            <w:pPr>
-              <w:spacing w:after="40"/>
-              <w:ind w:left="200"/>
-              <w:jc w:val="both"/>
-            </w:pPr>
-            <w:r>
-              <w:rPr>
-                <w:rFonts w:ascii="Arial" w:hAnsi="Arial" w:cs="Arial" w:eastAsia="Arial"/>
-                <w:b w:val="0"/>
-                <w:i w:val="0"/>
-                <w:color w:val="111111"/>
-                <w:sz w:val="18"/>
-              </w:rPr>
-              <w:t>•  10-12. ay · İP6 — Bütünleşik model, doğrulayıcı replikasyon, dış geçerlilik ve bağımsız yeniden koşum sınaması — Başarı ölçütü: Ön-kayıtlı birincil hipotezlerin en az %80'i replikasyon kümesinde aynı yönde; uyuşmazlıklar raporlanmış. Bağımsız koşumda deterministik metrikler %1 veya daha küçük sapmayla yeniden üretilmiş. Dış geçerlilikte en az beş dağılım ölçüsünde fark sayısal; gözlenen etki saptanabilir en küçük farkın altındaysa genelleme iddiası daraltılmış. Her mimari kısıtın katkısı %95 güven aralığıyla tek tabloda. (katkı %12)</w:t>
+              <w:t>•  10-12. ay · İP5 — Bütünleşik model, replikasyon, dış geçerlilik ve bağımsız koşum — Başarı ölçütü: Birincil hipotezlerin en az %80'i replikasyon kümesinde aynı yönde; yön uyuşmazlıkları gizlenmeden raporlanmış. Bağımsız koşumda deterministik metrikler %1 veya daha küçük sapmayla yeniden üretilmiş. Dış geçerlilikte en az beş dağılım ölçüsünde fark sayısal; gözlenen etki saptanabilir en küçük farkın altındaysa genelleme daraltılmış. Her mimari kısıtın katkısı %95 aralıkla tabloda toplanmış. (katkı %14)</w:t>
             </w:r>
           </w:p>
           <w:p>
@@ -3216,7 +3168,7 @@
                 <w:color w:val="111111"/>
                 <w:sz w:val="18"/>
               </w:rPr>
-              <w:t>•  RİSK: [İP5] Evrak ve yazı işleri görevi yürüten yeterli sayıda katılımcıya erişilememesi; 32 kişilik örneklemin tamamlanamaması.  →  B PLANI: Hipotezler, koşullar ve bağımlı değişkenler DEĞİŞMEZ; yalnız örneklem bileşimi değişir: kamu yönetimi, hukuk ve büro yönetimi alanlarında lisans/lisansüstü düzeyde, standart eğitim modülüyle görev yeterliliği sınanmış vekil katılımcılar kullanılır. Dış geçerlilik sınırı nicel raporlanır.</w:t>
+              <w:t>•  RİSK: [İP2] Bulut dil modeli servisinin sürüm/ad değiştirmesi veya erişimin kesilmesi.  →  B PLANI: Sağlayıcı, ilgi konusu etki değil blok değişkenidir; birincil koşullar iki bağımsız bulut servisinde ve bir yerel açık ağırlıklı modelde tekrarlanır. Bir servis erişilemezse hipotezler değil yalnız bir blok seviyesi düşer.</w:t>
             </w:r>
           </w:p>
           <w:p>
@@ -3233,7 +3185,7 @@
                 <w:color w:val="111111"/>
                 <w:sz w:val="18"/>
               </w:rPr>
-              <w:t>•  RİSK: [İP2] Bulut dil modeli servisinin sürüm/ad değiştirmesi ya da erişimin kesilmesi.  →  B PLANI: Sağlayıcı, ilgi konusu etki değil blok değişkenidir; birincil koşullar iki bağımsız bulut servisinde ve bir yerel açık ağırlıklı modelde tekrarlanır. Bir servis erişilemezse hipotezler değil yalnız bir blok seviyesi düşer. Her artefakta model ve kod sürümü damgalanır.</w:t>
+              <w:t>•  RİSK: [İP2 ve İP4] Ücretli servisin maliyet pilotunda ölçülenden pahalı çıkması ve bütçe tavanının aşılması.  →  B PLANI: Ana hipotezler ücretli servise bağımlı değildir; dört koldan biri ve hibrit kolun omurgası deterministiktir. Harcama, rezervasyonlu yalnız-ekleme defteriyle ve İP2 başındaki 20 belgelik pilotta ölçülen belge başına üst sınırla sınırlanır. Tavana yaklaşıldığında sağlayıcı bloğu üç seviyeden iki seviyeye iner, tekrar koşumlar yerel modele kayar; hangi blok seviyesinin düşeceği ön-kayıtta sabittir, birincil kontrastlar korunur.</w:t>
             </w:r>
           </w:p>
           <w:p>
@@ -3250,7 +3202,7 @@
                 <w:color w:val="111111"/>
                 <w:sz w:val="18"/>
               </w:rPr>
-              <w:t>•  RİSK: [İP2 ve İP4] Ücretli servis kullanımının pilotta ölçülenden pahalı çıkması; bütçe tavanının aşılması.  →  B PLANI: Ana hipotezler ücretli servise bağımlı değildir; dört koldan biri ve hibrit kolun omurgası deterministiktir. Harcama, rezervasyonlu yalnız-ekleme defteriyle ve İP1 pilotunda ölçülen üst sınırla sınırlanır. Tavana yaklaşıldığında sağlayıcı bloğu üç seviyeden ikiye iner, tekrar koşumlar yerel modele kayar; aşımın hangi BLOK SEVİYESİNİ düşüreceği önceden sabittir.</w:t>
+              <w:t>•  RİSK: [İP3] Değerlendiriciler arası uyumun hedefin altında kalması (Krippendorff alfanın kümelenmiş önyükleme %95 alt sınırının 0,67'yi aşmaması).  →  B PLANI: Düşük uyum gizlenmez, bulgunun kendisi olur. Tek seferlik kalibrasyon turuyla kodlama kılavuzu revize edilir; revizyon öncesi ve sonrası uyum ayrı yayımlanır. Düşük uyumlu iddia sınıfları geçerlilik sınırı olarak raporlanır ve H4 'kararsız' ilan edilir. İP4'ün kapısı H4'ün eşiğine değil altın kümenin tamamlanmasına bağlıdır.</w:t>
             </w:r>
           </w:p>
           <w:p>
@@ -3267,7 +3219,7 @@
                 <w:color w:val="111111"/>
                 <w:sz w:val="18"/>
               </w:rPr>
-              <w:t>•  RİSK: [İP3] Etiketleyiciler arası uyumun hedefin altında kalması (kümelenmiş önyükleme alt sınırı 0,67'yi aşmaz).  →  B PLANI: Düşük uyum gizlenmez, bulgunun kendisi olur. Tek seferlik kalibrasyon turuyla kodlama kılavuzu revize edilir; revizyon öncesi ve sonrası uyum ayrı yayımlanır, uyuşmazlıklar üçüncü hakem turuyla çözülür. Düşük uyumlu iddia sınıfları geçerlilik SINIRI olarak raporlanır; H4 'kararsız' ilan edilir. Diğer üç deney H4'ten bağımsız yürür.</w:t>
+              <w:t>•  RİSK: [İP3] Kör değerlendirme hizmetinin geç tedarik edilmesi veya üç değerlendiriciden birinin işi tamamlayamaması.  →  B PLANI: Ücretli değerlendirme iddia başına birim bedelle satın alınır; 300 iddialık küme 100'erlik üç partide teslim edilir, böylece gecikme son partiyi etkiler. Bir değerlendirici düşerse kodlama kılavuzuyla eğitilen bir yedek alınır; devir noktası uyum hesabında ayrı raporlanır. Desen, ölçüt ve hipotez değişmez; İP3'ün 4-7. ay penceresi İP4 ile iki aylık örtüşme payı bırakır.</w:t>
             </w:r>
           </w:p>
           <w:p>
@@ -3284,7 +3236,7 @@
                 <w:color w:val="111111"/>
                 <w:sz w:val="18"/>
               </w:rPr>
-              <w:t>•  RİSK: [İP6] Sentetik değerlendirme kümesinin gerçek evrak dağılımını temsil etmemesi.  →  B PLANI: Kişisel veri içermeyen, kamuya açık kaynaklardan türetilen 60 belgelik ikinci alt küme ilan edilmiş tarama protokolüyle oluşturulur; iki ön-kayıtlı hipotez orada onaylayıcı sınanır. Temsil farkı en az beş dağılım ölçüsünde nicel raporlanır. Gözlenen etki saptanabilir en küçük farkın altındaysa genelleme iddiası daraltılır.</w:t>
+              <w:t>•  RİSK: [İP1-İP5] Ekip üyelerinden birinin ayrılması veya uzun süreli devre dışı kalması.  →  B PLANI: Her İP'de birincil ve ikincil sorumlu tanımlıdır; ikincil sorumlu artefaktlara ve koşum betiklerine ilk aydan itibaren erişir. Altın etiketin ikinci bağımsız kaynağı, körlük şartı nedeniyle ekip içinden ikame edilemez; bu rol için danışmanın bölümünden, üreteci ve sözlüğü görmemiş bir yedek kişi ilk ayda belirlenir. Analiz betikleri sürüm damgalı ve tek komutla koşar biçimde tutulur.</w:t>
             </w:r>
           </w:p>
           <w:p>
@@ -3301,7 +3253,7 @@
                 <w:color w:val="111111"/>
                 <w:sz w:val="18"/>
               </w:rPr>
-              <w:t>•  RİSK: [İP1] Ön çalışma başarım sayılarının bayat olması ve bunların güncel başarım sanılması.  →  B PLANI: Hiçbir ön çalışma sayısı 'güncel başarım' sayılmaz; tümü ölçüm tarihi ve sürüm mesafesiyle fizibilite göstergesi olarak sunulur. İP1 çıktılarından biri, 13 bağımlı değişken için taban metriklerin güncel sürümle yeniden koşulmasıdır. Artefaktı olmayan iddialar 'gözlem' olarak nitelenir.</w:t>
+              <w:t>•  RİSK: [İP5] Sentetik değerlendirme kümesinin gerçek evrak dağılımını temsil etmemesi.  →  B PLANI: Kişisel veri içermeyen, kamuya açık kaynaklardan türetilen 60 belgelik ikinci alt küme ilan edilmiş tarama protokolüyle İP3'te oluşturulur; iki ön-kayıtlı hipotez orada onaylayıcı olarak sınanır ve temsil farkı nicel raporlanır.</w:t>
             </w:r>
           </w:p>
           <w:p>
@@ -3318,7 +3270,7 @@
                 <w:color w:val="111111"/>
                 <w:sz w:val="18"/>
               </w:rPr>
-              <w:t>•  RİSK: [İP1 ve İP3] Veri sızıntısı veya dairesellik: altın etiketleri üreten betiğin, değerlendirilen sistemle aynı sezgisel kuralları paylaşması.  →  B PLANI: Altın etiketler, sistemin sezgisel kurallarını yazan kişiden farklı bir ekip üyesince ve üretim sözlüğünden ayrık bir sözlükle kurulur; örtüşme oranı raporlanır. Ölçüt, sistemin kendi vetosu değil KÖR İNSAN yargısıdır. Sızıntı bulunursa ilgili küme taban olarak KULLANILMAZ.</w:t>
+              <w:t>•  RİSK: [İP1] Ön çalışma başarım sayılarının bayat olması ve bunların güncel başarım sanılması.  →  B PLANI: Hiçbir ön çalışma sayısı 'güncel başarım' sayılmaz; tümü ölçüm tarihi ve sürüm mesafesiyle fizibilite göstergesi sayılır. İP1 çıktılarından biri, taban metriklerin güncel sürümle yeniden koşulmasıdır; taban artefaktı olmayan hiçbir sayı başarım olarak alıntılanmaz.</w:t>
             </w:r>
           </w:p>
           <w:p>
@@ -3335,7 +3287,7 @@
                 <w:color w:val="111111"/>
                 <w:sz w:val="18"/>
               </w:rPr>
-              <w:t>•  RİSK: [İP5] Onaylı etik kurul protokolünün, deney tasarımının olgunlaşmasıyla revizyon gerektirmesi.  →  B PLANI: Onay belgesi başvuru ekindedir; başvuru İP4 penceresinde yapılır. Revizyon İP5 penceresini aşarsa İP6, ondan bağımsız iki faaliyetiyle (replikasyon, bağımsız yeniden koşum) 10. ayda başlatılır; bütünleşik model D1-D3 ile kurulup D4 son ay eklenir. D4 verisi 11. ay sonuna kadar tamamlanamazsa modelden çıkarılır, İP5 katkısı 22'den 18'e, İP6 katkısı 12'den 8'e düşürülüp fark İP4'e aktarılarak toplam 100 korunur.</w:t>
+              <w:t>•  RİSK: [İP1 ve İP3] Veri sızıntısı veya dairesellik: altın etiketleri üreten betiğin, değerlendirilen sistemle aynı sezgisel kuralları paylaşması.  →  B PLANI: Altın etiketler, sezgisel kuralları ve belge üretecini yazan kişiden farklı bir ekip üyesince, üretim sözlüğünden ayrık bir sözlükle kurulur; örtüşme oranı sayısal raporlanır, uyuşmazlıklar danışman hakemliğinde çözülür. Dayanaklılıkta ölçüt sistemin kendi vetosu değil kör uzman yargısıdır. Sızıntı bulunursa ilgili küme taban sayılmaz ve bu durum bulgu olarak yayımlanır.</w:t>
             </w:r>
           </w:p>
           <w:p>
@@ -3352,7 +3304,7 @@
                 <w:color w:val="111111"/>
                 <w:sz w:val="18"/>
               </w:rPr>
-              <w:t>•  RİSK: [İP2] Kısıtsız kolda kapalı küme dışına çıkan veya ayrıştırılamayan çıktı üretilmesi.  →  B PLANI: Ayrıştırılamayan çıktı sessizce yedeğe düşürülmez; birincil analizlerde niyet-tedavi ilkesiyle yanlış cevap kodlanır, geçersiz çıktı oranı ikincil bağımlı değişken olarak raporlanır. Ayrıştırma ve yeniden deneme kuralları tüm koşullarda aynıdır.</w:t>
+              <w:t>•  RİSK: [İP2] Kısıtsız kolda kapalı küme dışına çıkan veya ayrıştırılamayan çıktı üretilmesi.  →  B PLANI: Ayrıştırılamayan çıktı sessizce deterministik yedeğe düşürülmez; birincil analizlerde niyet-tedavi ilkesiyle yanlış kodlanır, geçersiz çıktı oranı ikincil bağımlı değişken olarak raporlanır. H1'in birincil karşılaştırması iki kolun da geçerli çıktı ürettiği alt kümede tekrarlanır (Katman B); A'daki üstünlük B'de kaybolursa bulgu biçim dayatması sayılır.</w:t>
             </w:r>
           </w:p>
           <w:p>
@@ -3369,7 +3321,7 @@
                 <w:color w:val="111111"/>
                 <w:sz w:val="18"/>
               </w:rPr>
-              <w:t>•  RİSK: [İP1 ve İP2] Etkileşim hipotezi (H2) ya da katılımcı deneyi kontrastları için simülasyonda gücün 0,80'in altında çıkması.  →  B PLANI: Ön-kayıtta üç dallı bağlayıcı karar kuralı ilan edilmiştir: güç 0,80 ve üzeriyse tasarım değişmez; 0,70-0,80 aralığındaysa bozulma faktörü ikiye indirilip belge sayısı 320'ye çıkarılır; 0,70'in altındaysa H2 keşifsel etiketlenir ve yerine aynı veriyle 0,80 güçle sınanabilen basit etki hipotezi birincil ilan edilir. Katılımcı deneyinde deneme sayısı 24'ten 32'ye, gerekirse katılımcı sayısı 32'den 40'a çıkarılır. Uygulanan dal ön-kayıtta görünür.</w:t>
+              <w:t>•  RİSK: [İP1 ve İP2] Etkileşim hipotezinin (H2) gücünün düşük olması; simülasyonda n = 240'ta ölçülen güç 0,314'tür.  →  B PLANI: Güç varsayılmamış, başvuru öncesinde simülasyonla ölçülmüş ve sınır gizlenmeden ilan edilmiştir. 0,80 güç için gereken yaklaşık 860 belge on iki ayda ve bu bütçede ulaşılamaz. Bu nedenle H2 için saptanabilir en küçük etkileşim ön-kayıtta 0,19 olarak ilan edilir; altında kalan bir gözlem 'anlamlı fark yoktur' diye değil, güç sınırlı ve sonuçsuz olarak, etki büyüklüğü ve %95 aralığıyla raporlanır. İP1'de yeniden koşulan tabanda eğilim 0,19'un altında fakat sıfırdan uzak görünürse H2'nin alt deseni 240 ek sentetik belgeyle n = 480'e çıkarılır; 1.440 ek koşum beklenmedik durum payından karşılanır ve saptanabilir en küçük etkileşim 0,13'e iner. Karar veriye değil İP1 pilotuna bakılarak, ön-kayıt kilidinden önce ve tarih damgalı verilir. Bozulma faktörü her koşulda üç seviyelidir; onaylayıcı ailenin büyüklüğü ve kapı yapısı değişmez.</w:t>
             </w:r>
           </w:p>
         </w:tc>
@@ -3614,7 +3566,7 @@
                 <w:color w:val="111111"/>
                 <w:sz w:val="18"/>
               </w:rPr>
-              <w:t>•  Donanım  →  Deneyler ekip üyelerinin mevcut kişisel bilgisayarlarında yürütülür; donanım alımı talep edilmemektedir. Birincil deney makinesi 6 çekirdekli / 12 iş parçacıklı, yaklaşık 3,8 GHz masaüstü işlemci, 48 GB sistem belleği, 12 GB görüntü belleğine sahip bir hesaplama hızlandırıcısı ve 1 TB katı hâl sürücü içerir. Yerel açık ağırlıklı model 4-bit nicelemeli çalıştırılacağından yaklaşık 6 GB görüntü belleği yeterlidir; mevcut 12 GB, bu kolu toplu koşumla tam kapasitede yürütmeye elverişlidir ve sağlayıcı bloğunun yerel seviyesi için ek kaynak gerektirmez. Katılımcı oturumları danışmanın bölümündeki mevcut derslik ve çalışma odalarında yürütülür.</w:t>
+              <w:t>•  Donanım  →  Deneyler ekip üyelerinin mevcut kişisel bilgisayarlarında yürütülür; donanım alımı talep edilmemektedir. Birincil deney makinesi 6 çekirdekli / 12 iş parçacıklı, yaklaşık 3,8 GHz masaüstü işlemci, 48 GB sistem belleği, 12 GB görüntü belleğine sahip bir hesaplama hızlandırıcısı ve 1 TB katı hâl sürücü içerir; ekipte ayrıca karakter hata oranı ölçümünde kullanılacak bir çok işlevli yazıcı-tarayıcı bulunmaktadır. Yerel açık ağırlıklı model 7-14 milyar parametre bandından seçilir; 4-bit nicelemede ağırlıklar 4-7 GB tutar, kalan görüntü belleği anahtar-değer önbelleği ve toplu koşum için yeterlidir. Mevcut 12 GB bu kolu tam kapasitede yürütmeye elverişlidir ve sağlayıcı bloğunun yerel seviyesi için ek kaynak gerektirmez. Deneylerin tamamı makine tarafında yürütüldüğünden derslik veya katılımcı mekânı ihtiyacı yoktur.</w:t>
             </w:r>
           </w:p>
           <w:p>
@@ -3665,7 +3617,7 @@
                 <w:color w:val="111111"/>
                 <w:sz w:val="18"/>
               </w:rPr>
-              <w:t>•  Danışman desteği  →  Danışman öğretim üyesi, ön-kayıt onayı, istatistiksel model denetimi, kodlama kılavuzu hakemliği ve etik uygunluk denetimi başlıklarında düzenli olarak katkı verecek; ayrıca katılımcı deneyi için bölüm içi duyuru ve mekân desteği sağlayacaktır.</w:t>
+              <w:t>•  Danışman desteği  →  Danışman öğretim üyesi, ön-kayıt onayı, istatistiksel model denetimi, kodlama kılavuzu hakemliği ve etik uygunluk denetimi başlıklarında düzenli olarak katkı verecek; ayrıca kör değerlendirmeye gönüllü katkı verecek iki değerlendiricinin belirlenmesi, niteliklerinin yazılı teyidi ve uyuşmazlık turu için koordinasyon desteği sağlayacaktır.</w:t>
             </w:r>
           </w:p>
           <w:p>
@@ -3682,7 +3634,7 @@
                 <w:color w:val="111111"/>
                 <w:sz w:val="18"/>
               </w:rPr>
-              <w:t>•  Dış hizmet  →  Yalnız iki kalemde ekip dışı hizmet alınacaktır - kör etiketleme (üç bağımsız etiketleyici) ve yeniden üretim paketinin ekip dışı bir kişi tarafından bağımsız koşturulması. Her ikisi de bütçede hizmet alımı olarak yer almakta olup proje ekibi üyesi değildirler.</w:t>
+              <w:t>•  Dış hizmet  →  Ekip dışından iki kalemde hizmet satın alınacaktır: kör değerlendirmenin ücretli değerlendiricisi ve yeniden üretim paketinin bağımsız koşturulması. Kör değerlendirmenin diğer iki değerlendiricisi danışmanın bölümünden gönüllü akademik katkı verir ve bütçeye gider yazılmaz; üçü de proje ekibi üyesi değildir ve sistemin kararını görmez.</w:t>
             </w:r>
           </w:p>
         </w:tc>
@@ -3989,20 +3941,23 @@
                 <w:color w:val="111111"/>
                 <w:sz w:val="18"/>
               </w:rPr>
-              <w:t>Çıktıların büyük bölümü iş paketleriyle (İP1-İP6) eşleştirilmiştir; her biri sayılı ve tarihlidir, belirleyici olanların kabul ölçütü önceden ilan edilmiştir. Ön-kayıtta kilitlenen hipotezlerden anlamsız çıkanlar da anlamlı çıkanlarla aynı ayrıntıda yayımlanacaktır; olumsuz bulgunun gizlenmesi bir çıktı kazancı değil, geçerlilik kaybı sayılır.</w:t>
+              <w:t>Çıktılar iş paketleriyle eşleştirilmiştir; her biri sayılı ve tarihlidir. Proje çıktıları için kabul ölçütü önceden ilan edilmiştir; bildiri, makale ve seminer ise yaygınlaştırma hedefidir. Anlamsız çıkan hipotezler de anlamlı çıkanlarla aynı ayrıntıda yayımlanacaktır; olumsuz bulgunun gizlenmesi geçerlilik kaybı sayılır.</w:t>
               <w:br/>
               <w:br/>
-              <w:t>- Açık erişimli ön-kayıt belgesi - 1 adet - 2. ay. Hipotezler, onaylayıcı test ailesi, dışlama ve aykırı değer ölçütleri ve analiz planı veri toplanmadan önce kamuya açılır. Kabul ölçütü: belgenin değiştirilemez zaman damgasıyla erişime açılması.</w:t>
+              <w:t>- Açık erişimli ön-kayıt belgesi - 1 adet - 2. ay. Hipotezler, on bir testlik aile, beş kapılı hiyerarşi, dışlama ölçütleri ve analiz planı veri toplanmadan önce kamuya açılır. Kabul ölçütü: değiştirilemez zaman damgasıyla erişime açılması.</w:t>
               <w:br/>
-              <w:t>- Ulusal hakemli kongre bildirisi - 1 adet - 10. ay. İçerik: katmanlı ölçüm kümesi ile mimari x girdi bozulma düzeyi faktöriyel deneyi (İP1-İP2). Kabul ölçütü: tam metnin hakem değerlendirmesinden geçip bildiri kitabında yayımlanması.</w:t>
+              <w:t>- Ulusal hakemli kongre bildirisi - 1 adet - 10. ayda gönderim. İçerik: katmanlı ölçüm kümesi ile mimari x bozulma faktöriyel deneyi (İP1-İP2). Yaygınlaştırma hedefidir; hakem kararı ekipte olmadığından yayım taahhüt edilmez.</w:t>
               <w:br/>
-              <w:t>- Uluslararası hakemli konferans bildirisi - 1 adet - 12. ayda gönderim. İçerik: kaynak-dayanak doğrulama kapısının sıkılık-ödünleşim eğrisi ve ölçüm geçerliliği; dayanaklılığı üretim sonrası etiketleyen çerçeveler [7] ve geri getirmeyle güçlendirilmiş üretimin hukuki alanda uydurmayı ortadan kaldırmadığı bulguları [9][10] üzerine, kısıtın mimariye gömüldüğü karşılaştırmalı ölçüm koyar.</w:t>
+              <w:t>- Uluslararası hakemli konferans bildirisi - 1 adet - 11. ayda gönderim. İçerik: kapının sıkılık-ödünleşim eğrisi ve doğrulayıcının kör uzman ölçütüne karşı ölçüm geçerliliği (İP3-İP4); dayanaklılığı üretim sonrası etiketleyen çerçeveler [7] ve geri getirmenin hukukta uydurmayı kaldırmadığı bulguları [9][10] üzerine karşılaştırmalı ölçüm koyar.</w:t>
               <w:br/>
-              <w:t>- Ulusal hakemli dergi makalesi - 1 adet - 12. ayda gönderim. İçerik: insan gözetiminin etkinliğini gerekçe düzeyi müdahalesi ve sistemsiz taban koşuluyla sınayan kontrollü katılımcı deneyi (İP5); gözetimi normatif düzeyde savunan alanyazına [16][17] ampirik ölçüm sunar.</w:t>
+              <w:t>- Ulusal hakemli dergi makalesi - 1 adet - 12. ayda gönderim; sorumlu yazar danışman öğretim üyesidir. İçerik: müzakerenin yakınsaması ile kapının gecikme ve maliyet bedeli (İP4); ölçüm birimi nihai cevap olan alanyazına [15] karşı, eleştirilerin kapanıp kapanmadığını defterleyen bir ölçüm sunar.</w:t>
               <w:br/>
               <w:t>- Lisans bitirme çalışması / öğrenci semineri - 2 adet - 8. ve 12. ay.</w:t>
               <w:br/>
-              <w:t>- Kitap, kitap bölümü ve patent hedeflenmemektedir; on iki aylık sürede ve bu ekip büyüklüğünde gerçekçi bulunmamıştır. Hedefin abartılmaması bilinçli bir tercihtir.</w:t>
+              <w:t>- Kitap, kitap bölümü ve patent hedeflenmemektedir; on iki ayda ve bu ekip büyüklüğünde gerçekçi bulunmamıştır.</w:t>
+              <w:br/>
+              <w:br/>
+              <w:t>Yayın çıktıları projenin başarı şartı değildir; projenin başarısı ön-kayıtlı hipotezlerin karar verilebilir biçimde sınanmasına ve açık veri ile açık kod çıktılarının teslimine bağlıdır.</w:t>
             </w:r>
           </w:p>
           <w:p>
@@ -4033,21 +3988,19 @@
                 <w:color w:val="111111"/>
                 <w:sz w:val="18"/>
               </w:rPr>
-              <w:t>- Açık erişimli değerlendirme veri tabanı - 1 adet, 360 belge (240 ana + 120 doğrulayıcı replikasyon) - 4. ayda ilk, 12. ayda nihai sürüm. On sekiz evrak türü ile çekimserlik etiketinden oluşan kapalı küme; tür, hedef birim, eksik zorunlu alan ve ilgili mevzuat alanlarında altın etiketli. Tamamı sentetik ve kurgudur; gerçek kişi, kurum kaydı, kimlik numarası, telefon veya adres içermez. Sürüm damgalı ve kalıcı tanımlayıcılı açık arşive, teknik belgelendirmesiyle yüklenir.</w:t>
+              <w:t>- Açık erişimli değerlendirme veri tabanı - 360 belge (240 ana + 120 replikasyon) - 4. ayda ilk, 12. ayda nihai sürüm. On sekiz evrak türü ile çekimserlik etiketinden oluşan kapalı küme; tür, hedef birim, eksik zorunlu alan ve ilgili mevzuat alanlarında altın etiketli. Tamamı sentetiktir; gerçek kişi, kurum kaydı veya kimlik bilgisi içermez. Kabul ölçütü: 360 belgenin iki bağımsız kaynakta etiketlenip kalıcı tanımlayıcılı açık arşive yüklenmesi.</w:t>
               <w:br/>
-              <w:t>- İddia düzeyi kör etiketli dayanaklılık altın kümesi ve kodlama kılavuzu - 300 iddia - 7. ay. Üç bağımsız etiketleyicinin tam çapraz tasarımla ürettiği etiketler, uyum katsayılarıyla yayımlanır.</w:t>
+              <w:t>- İddia düzeyi kör yargılanmış dayanaklılık altın kümesi ve kodlama kılavuzu - 300 iddia - 7. ay. Küme yalnız belge metnini, iddiayı ve verilen yargıyı içerir. Kabul ölçütü: 300 iddianın üç değerlendiricice tam çapraz desende yargılanması ve uyum katsayılarıyla yayımlanması.</w:t>
               <w:br/>
-              <w:t>- Açık kaynak ölçüm ve yeniden üretim paketi - 1 adet - 12. ay. İzin verici lisansla; güçlü karşılıklılık şartlı bağımlılıklar bilinçli dışlanır (kamu kurumunun benimsemesini hukuken zorlaştırır). Paket, dış servis erişimi olmadan deterministik kipte tek komutla koşar. Kabul ölçütü: ekip dışından bağımsız bir kişinin deterministik metrikleri en fazla yüzde bir sapmayla yeniden üretmesi (İP6).</w:t>
+              <w:t>- Açık kaynak ölçüm ve yeniden üretim paketi - 1 adet - 12. ay. İzin verici lisansla; güçlü karşılıklılık şartlı bağımlılıklar bilinçli dışlanır (kamu kurumunun benimsemesini zorlaştırır). Kabul ölçütü: ekip dışı bir kişinin deterministik metrikleri en fazla yüzde bir sapmayla yeniden üretmesi (İP5).</w:t>
               <w:br/>
-              <w:t>- Araştırma prototipi (ön çalışma prototipinin sürüm damgalı, dondurulmuş sürümü) - 1 adet - 12. ay. Ticari ürün olarak değil, ölçüm aracı olarak yayımlanır.</w:t>
+              <w:t>- Araştırma prototipi (ön çalışmanın dondurulmuş, sürüm damgalı sürümü) - 1 adet - 12. ay. Ticari ürün değil, ölçüm aracıdır.</w:t>
               <w:br/>
-              <w:t>- Uygulayıcıya yönelik çevrim içi açık seminer - 1 adet - proje bütçesi dışında ve takvime iş adımı eklenmeksizin planlanmaktadır. İçerik: karar destek çıktısının denetlenmesi ve kalibre güven bandının okunması. Katılımcı sayısı başarı ölçütü olarak taahhüt edilmemektedir; kamu görevlisi erişimi İP5 risk analizinde belirsizlik olarak ilan edilmiştir.</w:t>
+              <w:t>- Uygulayıcıya yönelik çevrim içi açık seminer ve kısa kılavuz - proje bütçesi dışında, takvime iş adımı eklenmeden ve açık lisansla paylaşılır; yaygınlaştırma hedefidir, kaç kişiye ulaşacağı taahhüt edilmez.</w:t>
               <w:br/>
-              <w:t>- Kısa uygulayıcı kılavuzu - 1 adet - açık lisansla, takvime ayrı iş adımı yazılmaksızın paylaşılır.</w:t>
+              <w:t>- Kamu kurumlarına somut fayda: bir çıktının 'dayanaklı' sayılmasını sağlayan otomatik ölçütün, sistemin beyanına değil kör uzman yargısına karşı geçerliliği ölçülür (İP3); kapı sıkılığının hangi yanlış-veto bedelini doğurduğu haritalanır (İP4). Gerekçe ön çalışmada ölçülmüştür: güven göstergesi daima yüksek görünürken mevzuat erişiminde ölçülen ilk-sıra isabeti 0,598 idi (204 belge). Epistemik türe göre ayrıştırılmış tam kalibrasyon bu projenin kapsamı dışındadır ve izleyen projeye bırakılmıştır.</w:t>
               <w:br/>
-              <w:t>- Kamu kurumlarına somut fayda: karar destek arayüzlerinin hangi gerekçe düzeyinde gerçekten denetlenebilir hâle geldiği ölçülür. Gerekçe ön çalışmada ölçülmüştür: güven göstergesi erişim kalitesinden bağımsız daima yüksek görünürken, mevzuat maddesi erişiminde ölçülen gerçek ilk-sıra isabeti 0,598 idi (204 belge); gösterge her beş belgenin ikisinde yanılıyor ve bunu bildirmiyordu. Çıktı, bu tür göstergelerin ölçülen isabete kalibre edilmesi için yeniden kullanılabilir bir yordamdır.</w:t>
-              <w:br/>
-              <w:t>- Patent veya faydalı model başvurusu hedeflenmemektedir. Gerekçe: yaygın etki stratejisi açık veri ve açık kaynaktır; bu, kamu kurumlarının açık kaynağa geçişini hedefleyen üst politika hükümleriyle [18][19] uyumludur ve tekrarlanabilirliğin ön koşuludur.</w:t>
+              <w:t>- Patent veya faydalı model hedeflenmemektedir; yaygın etki stratejisi açık veri ve açık kaynaktır, üst politika hükümleriyle [18][19] uyumludur.</w:t>
             </w:r>
           </w:p>
           <w:p>
@@ -4078,15 +4031,17 @@
                 <w:color w:val="111111"/>
                 <w:sz w:val="18"/>
               </w:rPr>
-              <w:t>- Ölçüm kümesinin, kişisel veri içermeyen ve kamuya açık kaynaklardan türetilen gerçek yazışma örnekleriyle genişletilmesi ve kurumlar arası genelleme başarımının sınanması: bilimsel ve teknolojik araştırma projeleri desteğine yeni öneri (12. ayda taslak).</w:t>
+              <w:t>- Ölçüm kümesinin, kişisel veri içermeyen kamuya açık kaynaklardan türetilen gerçek yazışma örnekleriyle genişletilmesi ve kurumlar arası genellemenin sınanması: araştırma projeleri desteğine yeni öneri (12. ayda taslak).</w:t>
               <w:br/>
-              <w:t>- İnsan gözetimi deneyinin daha büyük ve mesleki olarak çeşitlenmiş bir örneklemde tekrarlanması: lisansüstü tez konusu ve yurt içi lisansüstü burs başvurusu olarak kurgulanacaktır.</w:t>
+              <w:t>- Sinyallerin epistemik türüne (gözlem/çıkarım) göre ayrıştırılıp ölçülen isabete kalibre edilmesi - 1.1'deki B4'ün açık kalan bölümü - bağımsız bir izleyen projeye bırakılmıştır; girdisi İP4'ün ödünleşim eğrisi ve ayırt edicilik ölçümleridir.</w:t>
               <w:br/>
-              <w:t>- Rol tanımlı çok-ajanlı müzakerenin yakınsama davranışı, alanyazında ölçüm birimi nihai cevabın doğruluğu olduğu için açık kalmıştır [15]; İP4 çıktıları bunu bağımsız bir izleyen projeye taşıyacak olgunluktadır.</w:t>
+              <w:t>- Doğrulayıcının ölçüm geçerliliğinin, iddia sınıfları genişletilerek ve daha büyük bir kör uzman kümesiyle yeniden sınanması: lisansüstü tez konusu olarak kurgulanacaktır.</w:t>
               <w:br/>
-              <w:t>- Bildirilerin sunumu için yurt içi ve yurt dışı bilimsel etkinlik katılım destek programlarına başvurulacaktır; çağrı kuralları gereği bu giderler proje bütçesine dâhil edilmemiştir.</w:t>
+              <w:t>- Müzakerenin yakınsama davranışı alanyazında açık kalmıştır [15]; İP4 çıktıları bunu izleyen projeye taşır.</w:t>
               <w:br/>
-              <w:t>- Prototipin bir kamu kurumuyla saha pilotuna taşınması, kurum odaklı araştırma destekleri ile ulusal yeni fikirler ve ürünler desteği kapsamında değerlendirilecektir.</w:t>
+              <w:t>- Bildiri sunumu için etkinlik katılım destek programlarına başvurulacaktır; çağrı kuralları gereği bu giderler bütçeye dâhil edilmemiştir.</w:t>
+              <w:br/>
+              <w:t>- Prototipin bir kamu kurumuyla saha pilotuna taşınması, kurum odaklı destekler kapsamında değerlendirilecektir.</w:t>
             </w:r>
           </w:p>
         </w:tc>
@@ -4447,22 +4402,7 @@
                 <w:color w:val="111111"/>
                 <w:sz w:val="18"/>
               </w:rPr>
-              <w:t>ETİK KURUL DURUMU</w:t>
-            </w:r>
-          </w:p>
-          <w:p>
-            <w:pPr>
-              <w:spacing w:after="40"/>
-            </w:pPr>
-            <w:r>
-              <w:rPr>
-                <w:rFonts w:ascii="Arial" w:hAnsi="Arial" w:cs="Arial" w:eastAsia="Arial"/>
-                <w:b w:val="0"/>
-                <w:i w:val="0"/>
-                <w:color w:val="111111"/>
-                <w:sz w:val="18"/>
-              </w:rPr>
-              <w:t>GEREKLİDİR ve etik kurul ONAY BELGESİ başvuru ekinde sunulmuştur.</w:t>
+              <w:t>ETİK VE VERİ BEYANI</w:t>
             </w:r>
           </w:p>
           <w:p>
@@ -4478,7 +4418,7 @@
                 <w:color w:val="111111"/>
                 <w:sz w:val="18"/>
               </w:rPr>
-              <w:t>(1) MUAF OLAN KISIM: Belge tarafındaki deneyler (İP2, İP4, İP6 ve İP3'ün otomatik bileşeni) yalnızca sentetik/kurgu evrak ve kamuya açık mevzuat üzerinde yürütülür; gerçek kamu verisi, kişisel veri, kimlik numarası, telefon, adres veya kişi adı kullanılmaz. Ölçüm birimi belgedir; insan katılımcı içermediği için bu deneyler etik kurul kapsamı dışındadır ve tek başlarına muafiyet gerektirir.</w:t>
+              <w:t>(1) Araştırma insan katılımcı içermez. Gözlem ve ölçüm birimi belgedir ve belgeden çıkarılan metin içi iddiadır. Deneysel müdahale kişiye değil; karar kaynağının mimari biçimine, girdi bozulma düzeyine, kapı sıkılığına ve müzakere yoğunluğuna uygulanır. Üç deneyin koşumu da makine tarafındadır: kişi üzerinde gözlem, anket, görüşme veya deneysel işlem yapılmaz; tepki süresi, karar ya da öznel puan kaydedilmez.</w:t>
             </w:r>
           </w:p>
           <w:p>
@@ -4494,7 +4434,7 @@
                 <w:color w:val="111111"/>
                 <w:sz w:val="18"/>
               </w:rPr>
-              <w:t>(2) ONAY GEREKTİREN KISIM: İki iş paketi insan verisi üretir. İP5 katılımcı deneyinde 32 kişiden hata yakalama kararı, karar süresi ve öznel güven puanı toplanır ve deneysel bir müdahale (arayüz gerekçe düzeyi) uygulanır; bu insan katılımcılı bir araştırmadır, MUAFİYET İDDİA EDİLEMEZ. İP3 kör etiketlemede etiketleyicinin alan deneyimi KONTROL DEĞİŞKENİ olarak modellendiği, yani kişiye ilişkin veri toplandığı için muafiyet iddia edilmemiştir. İki çalışma tek etik kurul başvurusunda birleştirilmiş ve ....... Üniversitesi Girişimsel Olmayan Klinik Dışı Araştırmalar / Sosyal ve Beşerî Bilimler Etik Kurulu'nun ..../..../2026 tarih ve ......... sayılı kararıyla ONAYLANMIŞTIR. Onay belgesi başvuru ekinde sunulmuştur.</w:t>
+              <w:t>(2) Kullanılan evrakın tamamı sentetik ve kurgudur. Gerçek kamu evrakı, kurum kaydı ya da idari işlem temsil edilmez; kişi ve kurum adları, kimlik numaraları, telefon ve adres bilgileri sahte üretilir ve gerçek bir kişiye geri izlenemez. Mevzuat metinleri kamuya açık kaynaklardan alınır. Dış geçerlilik alt kümesi, kurumların sitelerinde kamuya açık yayımlanmış ve kişisel veri içermeyen yazılardan, ilan edilmiş bir tarama protokolüyle derlenir. Bu nedenle proje kapsamında 6698 sayılı Kişisel Verilerin Korunması Kanunu anlamında kişisel veri işlenmemektedir.</w:t>
             </w:r>
           </w:p>
           <w:p>
@@ -4510,7 +4450,7 @@
                 <w:color w:val="111111"/>
                 <w:sz w:val="18"/>
               </w:rPr>
-              <w:t>(3) TAKVİM VE KOŞUL: Proje kapsamındaki iş, onaylı protokolün uygulama yordamına dönüştürülmesidir. Onay kapsamı dışına çıkan hiçbir veri toplanmaz; protokol revizyonu gerekirse başvuru İP4 penceresinde yapılır ve onay alınmadan uygulanmaz.</w:t>
+              <w:t>(3) İddia düzeyi kör değerlendirme, üçü de ekip dışından olan üç bağımsız değerlendiriciyle yürütülür: biri hizmet alımıyla ücretlendirilir, ikisi danışmanın bölümünden gönüllü akademik katkı verir. Üçü de yalnız kaynak belgeyi ve iddiayı görür; sistemin kararını ve iddianın geldiği kolu görmez. Değerlendiriciler hakkında kişisel veri toplanmaz, kaydedilmez ve saklanmaz; mesleki deneyim, yaş, cinsiyet, öğrenim ya da kurum bilgisi kontrol değişkeni olarak kullanılmaz.</w:t>
             </w:r>
           </w:p>
           <w:p>

</xml_diff>